<commit_message>
M5 Tables Populated using Load Data Infile
</commit_message>
<xml_diff>
--- a/Smart Attendance Management System Version Control.docx
+++ b/Smart Attendance Management System Version Control.docx
@@ -533,6 +533,156 @@
           </w:p>
         </w:tc>
       </w:tr>
+      <w:tr>
+        <w:trPr>
+          <w:jc w:val="center"/>
+        </w:trPr>
+        <w:tc>
+          <w:tcPr>
+            <w:tcW w:w="2394" w:type="dxa"/>
+          </w:tcPr>
+          <w:p>
+            <w:pPr>
+              <w:jc w:val="center"/>
+              <w:rPr>
+                <w:rFonts w:ascii="Poppins Light" w:hAnsi="Poppins Light" w:cs="Poppins Light"/>
+              </w:rPr>
+            </w:pPr>
+            <w:r>
+              <w:rPr>
+                <w:rFonts w:ascii="Poppins Light" w:hAnsi="Poppins Light" w:cs="Poppins Light"/>
+              </w:rPr>
+              <w:t>Tables (DDL)</w:t>
+            </w:r>
+          </w:p>
+        </w:tc>
+        <w:tc>
+          <w:tcPr>
+            <w:tcW w:w="2394" w:type="dxa"/>
+          </w:tcPr>
+          <w:p>
+            <w:pPr>
+              <w:jc w:val="center"/>
+              <w:rPr>
+                <w:rFonts w:ascii="Poppins Light" w:hAnsi="Poppins Light" w:cs="Poppins Light"/>
+              </w:rPr>
+            </w:pPr>
+            <w:r>
+              <w:rPr>
+                <w:rFonts w:ascii="Poppins Light" w:hAnsi="Poppins Light" w:cs="Poppins Light"/>
+              </w:rPr>
+              <w:t>4.0</w:t>
+            </w:r>
+          </w:p>
+        </w:tc>
+        <w:tc>
+          <w:tcPr>
+            <w:tcW w:w="2394" w:type="dxa"/>
+          </w:tcPr>
+          <w:p>
+            <w:pPr>
+              <w:jc w:val="center"/>
+              <w:rPr>
+                <w:rFonts w:ascii="Poppins Light" w:hAnsi="Poppins Light" w:cs="Poppins Light"/>
+              </w:rPr>
+            </w:pPr>
+            <w:r>
+              <w:rPr>
+                <w:rFonts w:ascii="Poppins Light" w:hAnsi="Poppins Light" w:cs="Poppins Light"/>
+              </w:rPr>
+              <w:t>17-05-2026</w:t>
+            </w:r>
+          </w:p>
+        </w:tc>
+        <w:tc>
+          <w:tcPr>
+            <w:tcW w:w="2394" w:type="dxa"/>
+          </w:tcPr>
+          <w:p>
+            <w:pPr>
+              <w:jc w:val="center"/>
+              <w:rPr>
+                <w:rFonts w:ascii="Poppins Light" w:hAnsi="Poppins Light" w:cs="Poppins Light"/>
+              </w:rPr>
+            </w:pPr>
+          </w:p>
+        </w:tc>
+      </w:tr>
+      <w:tr>
+        <w:trPr>
+          <w:jc w:val="center"/>
+        </w:trPr>
+        <w:tc>
+          <w:tcPr>
+            <w:tcW w:w="2394" w:type="dxa"/>
+          </w:tcPr>
+          <w:p>
+            <w:pPr>
+              <w:jc w:val="center"/>
+              <w:rPr>
+                <w:rFonts w:ascii="Poppins Light" w:hAnsi="Poppins Light" w:cs="Poppins Light"/>
+              </w:rPr>
+            </w:pPr>
+            <w:r>
+              <w:rPr>
+                <w:rFonts w:ascii="Poppins Light" w:hAnsi="Poppins Light" w:cs="Poppins Light"/>
+              </w:rPr>
+              <w:t>Insertion (DML)</w:t>
+            </w:r>
+          </w:p>
+        </w:tc>
+        <w:tc>
+          <w:tcPr>
+            <w:tcW w:w="2394" w:type="dxa"/>
+          </w:tcPr>
+          <w:p>
+            <w:pPr>
+              <w:jc w:val="center"/>
+              <w:rPr>
+                <w:rFonts w:ascii="Poppins Light" w:hAnsi="Poppins Light" w:cs="Poppins Light"/>
+              </w:rPr>
+            </w:pPr>
+            <w:r>
+              <w:rPr>
+                <w:rFonts w:ascii="Poppins Light" w:hAnsi="Poppins Light" w:cs="Poppins Light"/>
+              </w:rPr>
+              <w:t>5.0</w:t>
+            </w:r>
+          </w:p>
+        </w:tc>
+        <w:tc>
+          <w:tcPr>
+            <w:tcW w:w="2394" w:type="dxa"/>
+          </w:tcPr>
+          <w:p>
+            <w:pPr>
+              <w:jc w:val="center"/>
+              <w:rPr>
+                <w:rFonts w:ascii="Poppins Light" w:hAnsi="Poppins Light" w:cs="Poppins Light"/>
+              </w:rPr>
+            </w:pPr>
+            <w:r>
+              <w:rPr>
+                <w:rFonts w:ascii="Poppins Light" w:hAnsi="Poppins Light" w:cs="Poppins Light"/>
+              </w:rPr>
+              <w:t>17-05-26</w:t>
+            </w:r>
+          </w:p>
+        </w:tc>
+        <w:tc>
+          <w:tcPr>
+            <w:tcW w:w="2394" w:type="dxa"/>
+          </w:tcPr>
+          <w:p>
+            <w:pPr>
+              <w:jc w:val="center"/>
+              <w:rPr>
+                <w:rFonts w:ascii="Poppins Light" w:hAnsi="Poppins Light" w:cs="Poppins Light"/>
+              </w:rPr>
+            </w:pPr>
+          </w:p>
+        </w:tc>
+      </w:tr>
     </w:tbl>
     <w:p>
       <w:pPr>
@@ -823,16 +973,7 @@
           <w:color w:val="17365D" w:themeColor="text2" w:themeShade="BF"/>
           <w:sz w:val="24"/>
         </w:rPr>
-        <w:t xml:space="preserve"> </w:t>
-      </w:r>
-      <w:r>
-        <w:rPr>
-          <w:rFonts w:ascii="Poppins Light" w:hAnsi="Poppins Light" w:cs="Poppins Light"/>
-          <w:b/>
-          <w:color w:val="17365D" w:themeColor="text2" w:themeShade="BF"/>
-          <w:sz w:val="24"/>
-        </w:rPr>
-        <w:t>4</w:t>
+        <w:t xml:space="preserve"> 4</w:t>
       </w:r>
       <w:r>
         <w:rPr>
@@ -898,6 +1039,150 @@
         </w:rPr>
         <w:t xml:space="preserve"> folder.</w:t>
       </w:r>
+    </w:p>
+    <w:p>
+      <w:pPr>
+        <w:rPr>
+          <w:rFonts w:ascii="Poppins Light" w:hAnsi="Poppins Light" w:cs="Poppins Light"/>
+          <w:b/>
+          <w:color w:val="17365D" w:themeColor="text2" w:themeShade="BF"/>
+          <w:sz w:val="24"/>
+        </w:rPr>
+      </w:pPr>
+      <w:r>
+        <w:rPr>
+          <w:rFonts w:ascii="Poppins Light" w:hAnsi="Poppins Light" w:cs="Poppins Light"/>
+          <w:b/>
+          <w:color w:val="17365D" w:themeColor="text2" w:themeShade="BF"/>
+          <w:sz w:val="24"/>
+        </w:rPr>
+        <w:lastRenderedPageBreak/>
+        <w:t>Milestone</w:t>
+      </w:r>
+      <w:r>
+        <w:rPr>
+          <w:rFonts w:ascii="Poppins Light" w:hAnsi="Poppins Light" w:cs="Poppins Light"/>
+          <w:b/>
+          <w:color w:val="17365D" w:themeColor="text2" w:themeShade="BF"/>
+          <w:sz w:val="24"/>
+        </w:rPr>
+        <w:t xml:space="preserve"> </w:t>
+      </w:r>
+      <w:r>
+        <w:rPr>
+          <w:rFonts w:ascii="Poppins Light" w:hAnsi="Poppins Light" w:cs="Poppins Light"/>
+          <w:b/>
+          <w:color w:val="17365D" w:themeColor="text2" w:themeShade="BF"/>
+          <w:sz w:val="24"/>
+        </w:rPr>
+        <w:t>5</w:t>
+      </w:r>
+      <w:r>
+        <w:rPr>
+          <w:rFonts w:ascii="Poppins Light" w:hAnsi="Poppins Light" w:cs="Poppins Light"/>
+          <w:b/>
+          <w:color w:val="17365D" w:themeColor="text2" w:themeShade="BF"/>
+          <w:sz w:val="24"/>
+        </w:rPr>
+        <w:t xml:space="preserve">: Version </w:t>
+      </w:r>
+      <w:r>
+        <w:rPr>
+          <w:rFonts w:ascii="Poppins Light" w:hAnsi="Poppins Light" w:cs="Poppins Light"/>
+          <w:b/>
+          <w:color w:val="17365D" w:themeColor="text2" w:themeShade="BF"/>
+          <w:sz w:val="24"/>
+        </w:rPr>
+        <w:t>5</w:t>
+      </w:r>
+      <w:r>
+        <w:rPr>
+          <w:rFonts w:ascii="Poppins Light" w:hAnsi="Poppins Light" w:cs="Poppins Light"/>
+          <w:b/>
+          <w:color w:val="17365D" w:themeColor="text2" w:themeShade="BF"/>
+          <w:sz w:val="24"/>
+        </w:rPr>
+        <w:t xml:space="preserve">.0: </w:t>
+      </w:r>
+      <w:r>
+        <w:rPr>
+          <w:rFonts w:ascii="Poppins Light" w:hAnsi="Poppins Light" w:cs="Poppins Light"/>
+          <w:b/>
+          <w:color w:val="17365D" w:themeColor="text2" w:themeShade="BF"/>
+          <w:sz w:val="24"/>
+        </w:rPr>
+        <w:t>DML</w:t>
+      </w:r>
+      <w:r>
+        <w:rPr>
+          <w:rFonts w:ascii="Poppins Light" w:hAnsi="Poppins Light" w:cs="Poppins Light"/>
+          <w:b/>
+          <w:color w:val="17365D" w:themeColor="text2" w:themeShade="BF"/>
+          <w:sz w:val="24"/>
+        </w:rPr>
+        <w:t xml:space="preserve"> Commands</w:t>
+      </w:r>
+      <w:r>
+        <w:rPr>
+          <w:rFonts w:ascii="Poppins Light" w:hAnsi="Poppins Light" w:cs="Poppins Light"/>
+          <w:b/>
+          <w:color w:val="17365D" w:themeColor="text2" w:themeShade="BF"/>
+          <w:sz w:val="24"/>
+        </w:rPr>
+        <w:t xml:space="preserve"> (Insertions)</w:t>
+      </w:r>
+    </w:p>
+    <w:p>
+      <w:pPr>
+        <w:rPr>
+          <w:rFonts w:ascii="Poppins Light" w:hAnsi="Poppins Light" w:cs="Poppins Light"/>
+          <w:color w:val="000000" w:themeColor="text1"/>
+          <w:sz w:val="24"/>
+        </w:rPr>
+      </w:pPr>
+      <w:r>
+        <w:rPr>
+          <w:rFonts w:ascii="Poppins Light" w:hAnsi="Poppins Light" w:cs="Poppins Light"/>
+          <w:color w:val="000000" w:themeColor="text1"/>
+          <w:sz w:val="24"/>
+        </w:rPr>
+        <w:t xml:space="preserve">Inserted data using Load Data </w:t>
+      </w:r>
+      <w:proofErr w:type="spellStart"/>
+      <w:r>
+        <w:rPr>
+          <w:rFonts w:ascii="Poppins Light" w:hAnsi="Poppins Light" w:cs="Poppins Light"/>
+          <w:color w:val="000000" w:themeColor="text1"/>
+          <w:sz w:val="24"/>
+        </w:rPr>
+        <w:t>Infile</w:t>
+      </w:r>
+      <w:proofErr w:type="spellEnd"/>
+      <w:r>
+        <w:rPr>
+          <w:rFonts w:ascii="Poppins Light" w:hAnsi="Poppins Light" w:cs="Poppins Light"/>
+          <w:color w:val="000000" w:themeColor="text1"/>
+          <w:sz w:val="24"/>
+        </w:rPr>
+        <w:t xml:space="preserve"> method. Check the file </w:t>
+      </w:r>
+      <w:hyperlink r:id="rId9" w:history="1">
+        <w:r>
+          <w:rPr>
+            <w:rStyle w:val="Hyperlink"/>
+            <w:rFonts w:ascii="Poppins Light" w:hAnsi="Poppins Light" w:cs="Poppins Light"/>
+            <w:sz w:val="24"/>
+          </w:rPr>
+          <w:t>Schema</w:t>
+        </w:r>
+      </w:hyperlink>
+    </w:p>
+    <w:p>
+      <w:pPr>
+        <w:rPr>
+          <w:rFonts w:ascii="Poppins Light" w:hAnsi="Poppins Light" w:cs="Poppins Light"/>
+        </w:rPr>
+      </w:pPr>
       <w:bookmarkStart w:id="0" w:name="_GoBack"/>
       <w:bookmarkEnd w:id="0"/>
     </w:p>
@@ -1308,7 +1593,7 @@
   <w:style w:type="paragraph" w:default="1" w:styleId="Normal">
     <w:name w:val="Normal"/>
     <w:qFormat/>
-    <w:rsid w:val="00E14198"/>
+    <w:rsid w:val="003C0857"/>
   </w:style>
   <w:style w:type="character" w:default="1" w:styleId="DefaultParagraphFont">
     <w:name w:val="Default Paragraph Font"/>

</xml_diff>